<commit_message>
Update report: add student info, video link, and GitHub link
</commit_message>
<xml_diff>
--- a/report/Project_Report_COE558_Final.docx
+++ b/report/Project_Report_COE558_Final.docx
@@ -296,7 +296,7 @@
                 <w:sz w:val="20"/>
                 <w:szCs w:val="20"/>
               </w:rPr>
-              <w:t xml:space="preserve">Shouq Almutairi</w:t>
+              <w:t xml:space="preserve">Abdullah Saeed Almalki</w:t>
             </w:r>
           </w:p>
         </w:tc>
@@ -327,7 +327,7 @@
                 <w:sz w:val="20"/>
                 <w:szCs w:val="20"/>
               </w:rPr>
-              <w:t xml:space="preserve">[Student ID]</w:t>
+              <w:t xml:space="preserve">202419960</w:t>
             </w:r>
           </w:p>
         </w:tc>
@@ -14198,7 +14198,7 @@
           <w:sz w:val="20"/>
           <w:szCs w:val="20"/>
         </w:rPr>
-        <w:t xml:space="preserve">GitHub repository — shooqealmutairi/coe558-cloud-ai-app</w:t>
+        <w:t xml:space="preserve">GitHub repository — https://github.com/asash3-lang/coe558-cloud-ai-app</w:t>
       </w:r>
       <w:r>
         <w:rPr>
@@ -18192,7 +18192,7 @@
                 <w:sz w:val="20"/>
                 <w:szCs w:val="20"/>
               </w:rPr>
-              <w:t xml:space="preserve">https://github.com/shooqealmutairi/coe558-cloud-ai-app</w:t>
+              <w:t xml:space="preserve">https://github.com/asash3-lang/coe558-cloud-ai-app</w:t>
             </w:r>
           </w:p>
         </w:tc>
@@ -18256,7 +18256,7 @@
                 <w:sz w:val="20"/>
                 <w:szCs w:val="20"/>
               </w:rPr>
-              <w:t xml:space="preserve">[Add Google Drive or YouTube link here]</w:t>
+              <w:t xml:space="preserve">https://drive.google.com/file/d/1wY5cBikgvICOAo52dJQFpbQYekBTbvYL/view?usp=sharing</w:t>
             </w:r>
           </w:p>
         </w:tc>
@@ -18898,25 +18898,6 @@
       </w:r>
     </w:p>
     <w:p>
-      <w:pPr>
-        <w:spacing w:after="140"/>
-        <w:jc w:val="both"/>
-      </w:pPr>
-      <w:r>
-        <w:rPr>
-          <w:rFonts w:ascii="Arial" w:cs="Arial" w:eastAsia="Arial" w:hAnsi="Arial"/>
-          <w:b w:val="false"/>
-          <w:bCs w:val="false"/>
-          <w:i/>
-          <w:iCs/>
-          <w:color w:val="555555"/>
-          <w:sz w:val="22"/>
-          <w:szCs w:val="22"/>
-        </w:rPr>
-        <w:t xml:space="preserve">Insert a screenshot for each item below by clicking inside the box in Microsoft Word and using Insert &gt; Pictures. Each box is labeled with what to capture and where to find it.</w:t>
-      </w:r>
-    </w:p>
-    <w:p>
       <w:r>
         <w:t xml:space="preserve"/>
       </w:r>
@@ -18950,7 +18931,7 @@
     </w:p>
     <w:p>
       <w:pPr>
-        <w:spacing w:after="80"/>
+        <w:spacing w:after="100"/>
       </w:pPr>
       <w:r>
         <w:rPr>
@@ -18961,116 +18942,53 @@
           <w:sz w:val="18"/>
           <w:szCs w:val="18"/>
         </w:rPr>
-        <w:t xml:space="preserve">Where to take it:  GCP Console → Cloud Run (show all services: weather, genai, crud, frontend, swagger-ui, graphql, async, worker)</w:t>
-      </w:r>
-    </w:p>
-    <w:tbl>
-      <w:tblPr>
-        <w:tblW w:type="dxa" w:w="9000"/>
-        <w:tblBorders>
-          <w:top w:val="single" w:color="auto" w:sz="4"/>
-          <w:left w:val="single" w:color="auto" w:sz="4"/>
-          <w:bottom w:val="single" w:color="auto" w:sz="4"/>
-          <w:right w:val="single" w:color="auto" w:sz="4"/>
-          <w:insideH w:val="single" w:color="auto" w:sz="4"/>
-          <w:insideV w:val="single" w:color="auto" w:sz="4"/>
-        </w:tblBorders>
-      </w:tblPr>
-      <w:tblGrid>
-        <w:gridCol w:w="9000"/>
-      </w:tblGrid>
-      <w:tr>
-        <w:tc>
-          <w:tcPr>
-            <w:tcW w:type="dxa" w:w="9000"/>
-            <w:tcBorders>
-              <w:top w:color="94A3B8" w:sz="6"/>
-              <w:left w:color="94A3B8" w:sz="6"/>
-              <w:bottom w:color="94A3B8" w:sz="6"/>
-              <w:right w:color="94A3B8" w:sz="6"/>
-            </w:tcBorders>
-            <w:shd w:fill="F7F9FC" w:val="clear"/>
-            <w:tcMar>
-              <w:top w:type="dxa" w:w="200"/>
-              <w:left w:type="dxa" w:w="160"/>
-              <w:bottom w:type="dxa" w:w="200"/>
-              <w:right w:type="dxa" w:w="160"/>
-            </w:tcMar>
-          </w:tcPr>
-          <w:p>
-            <w:pPr>
-              <w:spacing w:after="0"/>
-            </w:pPr>
-            <w:r>
-              <w:t xml:space="preserve"/>
-            </w:r>
-          </w:p>
-          <w:p>
-            <w:pPr>
-              <w:spacing w:after="0"/>
-            </w:pPr>
-            <w:r>
-              <w:t xml:space="preserve"/>
-            </w:r>
-          </w:p>
-          <w:p>
-            <w:pPr>
-              <w:spacing w:after="0"/>
-            </w:pPr>
-            <w:r>
-              <w:t xml:space="preserve"/>
-            </w:r>
-          </w:p>
-          <w:p>
-            <w:pPr>
-              <w:spacing w:after="0"/>
-              <w:jc w:val="center"/>
-            </w:pPr>
-            <w:r>
-              <w:rPr>
-                <w:rFonts w:ascii="Arial" w:cs="Arial" w:eastAsia="Arial" w:hAnsi="Arial"/>
-                <w:i/>
-                <w:iCs/>
-                <w:color w:val="B0B8C8"/>
-                <w:sz w:val="22"/>
-                <w:szCs w:val="22"/>
-              </w:rPr>
-              <w:t xml:space="preserve">[ Insert Screenshot Here ]</w:t>
-            </w:r>
-          </w:p>
-          <w:p>
-            <w:pPr>
-              <w:spacing w:after="0"/>
-            </w:pPr>
-            <w:r>
-              <w:t xml:space="preserve"/>
-            </w:r>
-          </w:p>
-          <w:p>
-            <w:pPr>
-              <w:spacing w:after="0"/>
-            </w:pPr>
-            <w:r>
-              <w:t xml:space="preserve"/>
-            </w:r>
-          </w:p>
-          <w:p>
-            <w:pPr>
-              <w:spacing w:after="0"/>
-            </w:pPr>
-            <w:r>
-              <w:t xml:space="preserve"/>
-            </w:r>
-          </w:p>
-        </w:tc>
-      </w:tr>
-    </w:tbl>
-    <w:p>
-      <w:pPr>
-        <w:spacing w:after="260"/>
-      </w:pPr>
-      <w:r>
-        <w:t xml:space="preserve"/>
+        <w:t xml:space="preserve">Where: GCP Console → Cloud Run</w:t>
+      </w:r>
+    </w:p>
+    <w:p>
+      <w:pPr>
+        <w:spacing w:after="300"/>
+        <w:jc w:val="center"/>
+      </w:pPr>
+      <w:r>
+        <w:drawing>
+          <wp:inline distT="0" distB="0" distL="0" distR="0">
+            <wp:extent cx="5619750" cy="3524250"/>
+            <wp:effectExtent t="0" r="0" b="0" l="0"/>
+            <wp:docPr id="1" name="screenshot-1" descr="Cloud Run — All 8 services showing Status: Active" title="Cloud Run — All 8 services showing Status: Active"/>
+            <wp:cNvGraphicFramePr>
+              <a:graphicFrameLocks xmlns:a="http://schemas.openxmlformats.org/drawingml/2006/main" noChangeAspect="1"/>
+            </wp:cNvGraphicFramePr>
+            <a:graphic xmlns:a="http://schemas.openxmlformats.org/drawingml/2006/main">
+              <a:graphicData uri="http://schemas.openxmlformats.org/drawingml/2006/picture">
+                <pic:pic xmlns:pic="http://schemas.openxmlformats.org/drawingml/2006/picture">
+                  <pic:nvPicPr>
+                    <pic:cNvPr id="0" name="" descr=""/>
+                    <pic:cNvPicPr>
+                      <a:picLocks noChangeAspect="1" noChangeArrowheads="1"/>
+                    </pic:cNvPicPr>
+                  </pic:nvPicPr>
+                  <pic:blipFill>
+                    <a:blip r:embed="rId9" cstate="none"/>
+                    <a:srcRect/>
+                    <a:stretch>
+                      <a:fillRect/>
+                    </a:stretch>
+                  </pic:blipFill>
+                  <pic:spPr bwMode="auto">
+                    <a:xfrm>
+                      <a:off x="0" y="0"/>
+                      <a:ext cx="5619750" cy="3524250"/>
+                    </a:xfrm>
+                    <a:prstGeom prst="rect">
+                      <a:avLst/>
+                    </a:prstGeom>
+                  </pic:spPr>
+                </pic:pic>
+              </a:graphicData>
+            </a:graphic>
+          </wp:inline>
+        </w:drawing>
       </w:r>
     </w:p>
     <w:p>
@@ -19102,7 +19020,7 @@
     </w:p>
     <w:p>
       <w:pPr>
-        <w:spacing w:after="80"/>
+        <w:spacing w:after="100"/>
       </w:pPr>
       <w:r>
         <w:rPr>
@@ -19113,116 +19031,53 @@
           <w:sz w:val="18"/>
           <w:szCs w:val="18"/>
         </w:rPr>
-        <w:t xml:space="preserve">Where to take it:  GCP Console → API Gateway → Gateways → click cloud-ai-gateway</w:t>
-      </w:r>
-    </w:p>
-    <w:tbl>
-      <w:tblPr>
-        <w:tblW w:type="dxa" w:w="9000"/>
-        <w:tblBorders>
-          <w:top w:val="single" w:color="auto" w:sz="4"/>
-          <w:left w:val="single" w:color="auto" w:sz="4"/>
-          <w:bottom w:val="single" w:color="auto" w:sz="4"/>
-          <w:right w:val="single" w:color="auto" w:sz="4"/>
-          <w:insideH w:val="single" w:color="auto" w:sz="4"/>
-          <w:insideV w:val="single" w:color="auto" w:sz="4"/>
-        </w:tblBorders>
-      </w:tblPr>
-      <w:tblGrid>
-        <w:gridCol w:w="9000"/>
-      </w:tblGrid>
-      <w:tr>
-        <w:tc>
-          <w:tcPr>
-            <w:tcW w:type="dxa" w:w="9000"/>
-            <w:tcBorders>
-              <w:top w:color="94A3B8" w:sz="6"/>
-              <w:left w:color="94A3B8" w:sz="6"/>
-              <w:bottom w:color="94A3B8" w:sz="6"/>
-              <w:right w:color="94A3B8" w:sz="6"/>
-            </w:tcBorders>
-            <w:shd w:fill="F7F9FC" w:val="clear"/>
-            <w:tcMar>
-              <w:top w:type="dxa" w:w="200"/>
-              <w:left w:type="dxa" w:w="160"/>
-              <w:bottom w:type="dxa" w:w="200"/>
-              <w:right w:type="dxa" w:w="160"/>
-            </w:tcMar>
-          </w:tcPr>
-          <w:p>
-            <w:pPr>
-              <w:spacing w:after="0"/>
-            </w:pPr>
-            <w:r>
-              <w:t xml:space="preserve"/>
-            </w:r>
-          </w:p>
-          <w:p>
-            <w:pPr>
-              <w:spacing w:after="0"/>
-            </w:pPr>
-            <w:r>
-              <w:t xml:space="preserve"/>
-            </w:r>
-          </w:p>
-          <w:p>
-            <w:pPr>
-              <w:spacing w:after="0"/>
-            </w:pPr>
-            <w:r>
-              <w:t xml:space="preserve"/>
-            </w:r>
-          </w:p>
-          <w:p>
-            <w:pPr>
-              <w:spacing w:after="0"/>
-              <w:jc w:val="center"/>
-            </w:pPr>
-            <w:r>
-              <w:rPr>
-                <w:rFonts w:ascii="Arial" w:cs="Arial" w:eastAsia="Arial" w:hAnsi="Arial"/>
-                <w:i/>
-                <w:iCs/>
-                <w:color w:val="B0B8C8"/>
-                <w:sz w:val="22"/>
-                <w:szCs w:val="22"/>
-              </w:rPr>
-              <w:t xml:space="preserve">[ Insert Screenshot Here ]</w:t>
-            </w:r>
-          </w:p>
-          <w:p>
-            <w:pPr>
-              <w:spacing w:after="0"/>
-            </w:pPr>
-            <w:r>
-              <w:t xml:space="preserve"/>
-            </w:r>
-          </w:p>
-          <w:p>
-            <w:pPr>
-              <w:spacing w:after="0"/>
-            </w:pPr>
-            <w:r>
-              <w:t xml:space="preserve"/>
-            </w:r>
-          </w:p>
-          <w:p>
-            <w:pPr>
-              <w:spacing w:after="0"/>
-            </w:pPr>
-            <w:r>
-              <w:t xml:space="preserve"/>
-            </w:r>
-          </w:p>
-        </w:tc>
-      </w:tr>
-    </w:tbl>
-    <w:p>
-      <w:pPr>
-        <w:spacing w:after="260"/>
-      </w:pPr>
-      <w:r>
-        <w:t xml:space="preserve"/>
+        <w:t xml:space="preserve">Where: GCP Console → API Gateway → Gateways</w:t>
+      </w:r>
+    </w:p>
+    <w:p>
+      <w:pPr>
+        <w:spacing w:after="300"/>
+        <w:jc w:val="center"/>
+      </w:pPr>
+      <w:r>
+        <w:drawing>
+          <wp:inline distT="0" distB="0" distL="0" distR="0">
+            <wp:extent cx="5619750" cy="3524250"/>
+            <wp:effectExtent t="0" r="0" b="0" l="0"/>
+            <wp:docPr id="1" name="screenshot-2" descr="API Gateway — cloud-ai-gateway Active with the gateway URL" title="API Gateway — cloud-ai-gateway Active with the gateway URL"/>
+            <wp:cNvGraphicFramePr>
+              <a:graphicFrameLocks xmlns:a="http://schemas.openxmlformats.org/drawingml/2006/main" noChangeAspect="1"/>
+            </wp:cNvGraphicFramePr>
+            <a:graphic xmlns:a="http://schemas.openxmlformats.org/drawingml/2006/main">
+              <a:graphicData uri="http://schemas.openxmlformats.org/drawingml/2006/picture">
+                <pic:pic xmlns:pic="http://schemas.openxmlformats.org/drawingml/2006/picture">
+                  <pic:nvPicPr>
+                    <pic:cNvPr id="0" name="" descr=""/>
+                    <pic:cNvPicPr>
+                      <a:picLocks noChangeAspect="1" noChangeArrowheads="1"/>
+                    </pic:cNvPicPr>
+                  </pic:nvPicPr>
+                  <pic:blipFill>
+                    <a:blip r:embed="rId10" cstate="none"/>
+                    <a:srcRect/>
+                    <a:stretch>
+                      <a:fillRect/>
+                    </a:stretch>
+                  </pic:blipFill>
+                  <pic:spPr bwMode="auto">
+                    <a:xfrm>
+                      <a:off x="0" y="0"/>
+                      <a:ext cx="5619750" cy="3524250"/>
+                    </a:xfrm>
+                    <a:prstGeom prst="rect">
+                      <a:avLst/>
+                    </a:prstGeom>
+                  </pic:spPr>
+                </pic:pic>
+              </a:graphicData>
+            </a:graphic>
+          </wp:inline>
+        </w:drawing>
       </w:r>
     </w:p>
     <w:p>
@@ -19254,7 +19109,7 @@
     </w:p>
     <w:p>
       <w:pPr>
-        <w:spacing w:after="80"/>
+        <w:spacing w:after="100"/>
       </w:pPr>
       <w:r>
         <w:rPr>
@@ -19265,116 +19120,53 @@
           <w:sz w:val="18"/>
           <w:szCs w:val="18"/>
         </w:rPr>
-        <w:t xml:space="preserve">Where to take it:  GCP Console → Firestore → Data → genai-history collection</w:t>
-      </w:r>
-    </w:p>
-    <w:tbl>
-      <w:tblPr>
-        <w:tblW w:type="dxa" w:w="9000"/>
-        <w:tblBorders>
-          <w:top w:val="single" w:color="auto" w:sz="4"/>
-          <w:left w:val="single" w:color="auto" w:sz="4"/>
-          <w:bottom w:val="single" w:color="auto" w:sz="4"/>
-          <w:right w:val="single" w:color="auto" w:sz="4"/>
-          <w:insideH w:val="single" w:color="auto" w:sz="4"/>
-          <w:insideV w:val="single" w:color="auto" w:sz="4"/>
-        </w:tblBorders>
-      </w:tblPr>
-      <w:tblGrid>
-        <w:gridCol w:w="9000"/>
-      </w:tblGrid>
-      <w:tr>
-        <w:tc>
-          <w:tcPr>
-            <w:tcW w:type="dxa" w:w="9000"/>
-            <w:tcBorders>
-              <w:top w:color="94A3B8" w:sz="6"/>
-              <w:left w:color="94A3B8" w:sz="6"/>
-              <w:bottom w:color="94A3B8" w:sz="6"/>
-              <w:right w:color="94A3B8" w:sz="6"/>
-            </w:tcBorders>
-            <w:shd w:fill="F7F9FC" w:val="clear"/>
-            <w:tcMar>
-              <w:top w:type="dxa" w:w="200"/>
-              <w:left w:type="dxa" w:w="160"/>
-              <w:bottom w:type="dxa" w:w="200"/>
-              <w:right w:type="dxa" w:w="160"/>
-            </w:tcMar>
-          </w:tcPr>
-          <w:p>
-            <w:pPr>
-              <w:spacing w:after="0"/>
-            </w:pPr>
-            <w:r>
-              <w:t xml:space="preserve"/>
-            </w:r>
-          </w:p>
-          <w:p>
-            <w:pPr>
-              <w:spacing w:after="0"/>
-            </w:pPr>
-            <w:r>
-              <w:t xml:space="preserve"/>
-            </w:r>
-          </w:p>
-          <w:p>
-            <w:pPr>
-              <w:spacing w:after="0"/>
-            </w:pPr>
-            <w:r>
-              <w:t xml:space="preserve"/>
-            </w:r>
-          </w:p>
-          <w:p>
-            <w:pPr>
-              <w:spacing w:after="0"/>
-              <w:jc w:val="center"/>
-            </w:pPr>
-            <w:r>
-              <w:rPr>
-                <w:rFonts w:ascii="Arial" w:cs="Arial" w:eastAsia="Arial" w:hAnsi="Arial"/>
-                <w:i/>
-                <w:iCs/>
-                <w:color w:val="B0B8C8"/>
-                <w:sz w:val="22"/>
-                <w:szCs w:val="22"/>
-              </w:rPr>
-              <w:t xml:space="preserve">[ Insert Screenshot Here ]</w:t>
-            </w:r>
-          </w:p>
-          <w:p>
-            <w:pPr>
-              <w:spacing w:after="0"/>
-            </w:pPr>
-            <w:r>
-              <w:t xml:space="preserve"/>
-            </w:r>
-          </w:p>
-          <w:p>
-            <w:pPr>
-              <w:spacing w:after="0"/>
-            </w:pPr>
-            <w:r>
-              <w:t xml:space="preserve"/>
-            </w:r>
-          </w:p>
-          <w:p>
-            <w:pPr>
-              <w:spacing w:after="0"/>
-            </w:pPr>
-            <w:r>
-              <w:t xml:space="preserve"/>
-            </w:r>
-          </w:p>
-        </w:tc>
-      </w:tr>
-    </w:tbl>
-    <w:p>
-      <w:pPr>
-        <w:spacing w:after="260"/>
-      </w:pPr>
-      <w:r>
-        <w:t xml:space="preserve"/>
+        <w:t xml:space="preserve">Where: GCP Console → Firestore → Data</w:t>
+      </w:r>
+    </w:p>
+    <w:p>
+      <w:pPr>
+        <w:spacing w:after="300"/>
+        <w:jc w:val="center"/>
+      </w:pPr>
+      <w:r>
+        <w:drawing>
+          <wp:inline distT="0" distB="0" distL="0" distR="0">
+            <wp:extent cx="5619750" cy="3524250"/>
+            <wp:effectExtent t="0" r="0" b="0" l="0"/>
+            <wp:docPr id="1" name="screenshot-3" descr="Firestore — genai-history collection with sample documents" title="Firestore — genai-history collection with sample documents"/>
+            <wp:cNvGraphicFramePr>
+              <a:graphicFrameLocks xmlns:a="http://schemas.openxmlformats.org/drawingml/2006/main" noChangeAspect="1"/>
+            </wp:cNvGraphicFramePr>
+            <a:graphic xmlns:a="http://schemas.openxmlformats.org/drawingml/2006/main">
+              <a:graphicData uri="http://schemas.openxmlformats.org/drawingml/2006/picture">
+                <pic:pic xmlns:pic="http://schemas.openxmlformats.org/drawingml/2006/picture">
+                  <pic:nvPicPr>
+                    <pic:cNvPr id="0" name="" descr=""/>
+                    <pic:cNvPicPr>
+                      <a:picLocks noChangeAspect="1" noChangeArrowheads="1"/>
+                    </pic:cNvPicPr>
+                  </pic:nvPicPr>
+                  <pic:blipFill>
+                    <a:blip r:embed="rId11" cstate="none"/>
+                    <a:srcRect/>
+                    <a:stretch>
+                      <a:fillRect/>
+                    </a:stretch>
+                  </pic:blipFill>
+                  <pic:spPr bwMode="auto">
+                    <a:xfrm>
+                      <a:off x="0" y="0"/>
+                      <a:ext cx="5619750" cy="3524250"/>
+                    </a:xfrm>
+                    <a:prstGeom prst="rect">
+                      <a:avLst/>
+                    </a:prstGeom>
+                  </pic:spPr>
+                </pic:pic>
+              </a:graphicData>
+            </a:graphic>
+          </wp:inline>
+        </w:drawing>
       </w:r>
     </w:p>
     <w:p>
@@ -19406,7 +19198,7 @@
     </w:p>
     <w:p>
       <w:pPr>
-        <w:spacing w:after="80"/>
+        <w:spacing w:after="100"/>
       </w:pPr>
       <w:r>
         <w:rPr>
@@ -19417,116 +19209,53 @@
           <w:sz w:val="18"/>
           <w:szCs w:val="18"/>
         </w:rPr>
-        <w:t xml:space="preserve">Where to take it:  GCP Console → Cloud Storage → manifest-bit-494908-a5-genai-images → images/ folder</w:t>
-      </w:r>
-    </w:p>
-    <w:tbl>
-      <w:tblPr>
-        <w:tblW w:type="dxa" w:w="9000"/>
-        <w:tblBorders>
-          <w:top w:val="single" w:color="auto" w:sz="4"/>
-          <w:left w:val="single" w:color="auto" w:sz="4"/>
-          <w:bottom w:val="single" w:color="auto" w:sz="4"/>
-          <w:right w:val="single" w:color="auto" w:sz="4"/>
-          <w:insideH w:val="single" w:color="auto" w:sz="4"/>
-          <w:insideV w:val="single" w:color="auto" w:sz="4"/>
-        </w:tblBorders>
-      </w:tblPr>
-      <w:tblGrid>
-        <w:gridCol w:w="9000"/>
-      </w:tblGrid>
-      <w:tr>
-        <w:tc>
-          <w:tcPr>
-            <w:tcW w:type="dxa" w:w="9000"/>
-            <w:tcBorders>
-              <w:top w:color="94A3B8" w:sz="6"/>
-              <w:left w:color="94A3B8" w:sz="6"/>
-              <w:bottom w:color="94A3B8" w:sz="6"/>
-              <w:right w:color="94A3B8" w:sz="6"/>
-            </w:tcBorders>
-            <w:shd w:fill="F7F9FC" w:val="clear"/>
-            <w:tcMar>
-              <w:top w:type="dxa" w:w="200"/>
-              <w:left w:type="dxa" w:w="160"/>
-              <w:bottom w:type="dxa" w:w="200"/>
-              <w:right w:type="dxa" w:w="160"/>
-            </w:tcMar>
-          </w:tcPr>
-          <w:p>
-            <w:pPr>
-              <w:spacing w:after="0"/>
-            </w:pPr>
-            <w:r>
-              <w:t xml:space="preserve"/>
-            </w:r>
-          </w:p>
-          <w:p>
-            <w:pPr>
-              <w:spacing w:after="0"/>
-            </w:pPr>
-            <w:r>
-              <w:t xml:space="preserve"/>
-            </w:r>
-          </w:p>
-          <w:p>
-            <w:pPr>
-              <w:spacing w:after="0"/>
-            </w:pPr>
-            <w:r>
-              <w:t xml:space="preserve"/>
-            </w:r>
-          </w:p>
-          <w:p>
-            <w:pPr>
-              <w:spacing w:after="0"/>
-              <w:jc w:val="center"/>
-            </w:pPr>
-            <w:r>
-              <w:rPr>
-                <w:rFonts w:ascii="Arial" w:cs="Arial" w:eastAsia="Arial" w:hAnsi="Arial"/>
-                <w:i/>
-                <w:iCs/>
-                <w:color w:val="B0B8C8"/>
-                <w:sz w:val="22"/>
-                <w:szCs w:val="22"/>
-              </w:rPr>
-              <w:t xml:space="preserve">[ Insert Screenshot Here ]</w:t>
-            </w:r>
-          </w:p>
-          <w:p>
-            <w:pPr>
-              <w:spacing w:after="0"/>
-            </w:pPr>
-            <w:r>
-              <w:t xml:space="preserve"/>
-            </w:r>
-          </w:p>
-          <w:p>
-            <w:pPr>
-              <w:spacing w:after="0"/>
-            </w:pPr>
-            <w:r>
-              <w:t xml:space="preserve"/>
-            </w:r>
-          </w:p>
-          <w:p>
-            <w:pPr>
-              <w:spacing w:after="0"/>
-            </w:pPr>
-            <w:r>
-              <w:t xml:space="preserve"/>
-            </w:r>
-          </w:p>
-        </w:tc>
-      </w:tr>
-    </w:tbl>
-    <w:p>
-      <w:pPr>
-        <w:spacing w:after="260"/>
-      </w:pPr>
-      <w:r>
-        <w:t xml:space="preserve"/>
+        <w:t xml:space="preserve">Where: GCP Console → Cloud Storage</w:t>
+      </w:r>
+    </w:p>
+    <w:p>
+      <w:pPr>
+        <w:spacing w:after="300"/>
+        <w:jc w:val="center"/>
+      </w:pPr>
+      <w:r>
+        <w:drawing>
+          <wp:inline distT="0" distB="0" distL="0" distR="0">
+            <wp:extent cx="5619750" cy="3524250"/>
+            <wp:effectExtent t="0" r="0" b="0" l="0"/>
+            <wp:docPr id="1" name="screenshot-4" descr="Cloud Storage — bucket with uploaded JPEG image files" title="Cloud Storage — bucket with uploaded JPEG image files"/>
+            <wp:cNvGraphicFramePr>
+              <a:graphicFrameLocks xmlns:a="http://schemas.openxmlformats.org/drawingml/2006/main" noChangeAspect="1"/>
+            </wp:cNvGraphicFramePr>
+            <a:graphic xmlns:a="http://schemas.openxmlformats.org/drawingml/2006/main">
+              <a:graphicData uri="http://schemas.openxmlformats.org/drawingml/2006/picture">
+                <pic:pic xmlns:pic="http://schemas.openxmlformats.org/drawingml/2006/picture">
+                  <pic:nvPicPr>
+                    <pic:cNvPr id="0" name="" descr=""/>
+                    <pic:cNvPicPr>
+                      <a:picLocks noChangeAspect="1" noChangeArrowheads="1"/>
+                    </pic:cNvPicPr>
+                  </pic:nvPicPr>
+                  <pic:blipFill>
+                    <a:blip r:embed="rId12" cstate="none"/>
+                    <a:srcRect/>
+                    <a:stretch>
+                      <a:fillRect/>
+                    </a:stretch>
+                  </pic:blipFill>
+                  <pic:spPr bwMode="auto">
+                    <a:xfrm>
+                      <a:off x="0" y="0"/>
+                      <a:ext cx="5619750" cy="3524250"/>
+                    </a:xfrm>
+                    <a:prstGeom prst="rect">
+                      <a:avLst/>
+                    </a:prstGeom>
+                  </pic:spPr>
+                </pic:pic>
+              </a:graphicData>
+            </a:graphic>
+          </wp:inline>
+        </w:drawing>
       </w:r>
     </w:p>
     <w:p>
@@ -19558,7 +19287,7 @@
     </w:p>
     <w:p>
       <w:pPr>
-        <w:spacing w:after="80"/>
+        <w:spacing w:after="100"/>
       </w:pPr>
       <w:r>
         <w:rPr>
@@ -19569,116 +19298,53 @@
           <w:sz w:val="18"/>
           <w:szCs w:val="18"/>
         </w:rPr>
-        <w:t xml:space="preserve">Where to take it:  GCP Console → APIs &amp; Services → Enabled APIs → search "Vertex AI API"</w:t>
-      </w:r>
-    </w:p>
-    <w:tbl>
-      <w:tblPr>
-        <w:tblW w:type="dxa" w:w="9000"/>
-        <w:tblBorders>
-          <w:top w:val="single" w:color="auto" w:sz="4"/>
-          <w:left w:val="single" w:color="auto" w:sz="4"/>
-          <w:bottom w:val="single" w:color="auto" w:sz="4"/>
-          <w:right w:val="single" w:color="auto" w:sz="4"/>
-          <w:insideH w:val="single" w:color="auto" w:sz="4"/>
-          <w:insideV w:val="single" w:color="auto" w:sz="4"/>
-        </w:tblBorders>
-      </w:tblPr>
-      <w:tblGrid>
-        <w:gridCol w:w="9000"/>
-      </w:tblGrid>
-      <w:tr>
-        <w:tc>
-          <w:tcPr>
-            <w:tcW w:type="dxa" w:w="9000"/>
-            <w:tcBorders>
-              <w:top w:color="94A3B8" w:sz="6"/>
-              <w:left w:color="94A3B8" w:sz="6"/>
-              <w:bottom w:color="94A3B8" w:sz="6"/>
-              <w:right w:color="94A3B8" w:sz="6"/>
-            </w:tcBorders>
-            <w:shd w:fill="F7F9FC" w:val="clear"/>
-            <w:tcMar>
-              <w:top w:type="dxa" w:w="200"/>
-              <w:left w:type="dxa" w:w="160"/>
-              <w:bottom w:type="dxa" w:w="200"/>
-              <w:right w:type="dxa" w:w="160"/>
-            </w:tcMar>
-          </w:tcPr>
-          <w:p>
-            <w:pPr>
-              <w:spacing w:after="0"/>
-            </w:pPr>
-            <w:r>
-              <w:t xml:space="preserve"/>
-            </w:r>
-          </w:p>
-          <w:p>
-            <w:pPr>
-              <w:spacing w:after="0"/>
-            </w:pPr>
-            <w:r>
-              <w:t xml:space="preserve"/>
-            </w:r>
-          </w:p>
-          <w:p>
-            <w:pPr>
-              <w:spacing w:after="0"/>
-            </w:pPr>
-            <w:r>
-              <w:t xml:space="preserve"/>
-            </w:r>
-          </w:p>
-          <w:p>
-            <w:pPr>
-              <w:spacing w:after="0"/>
-              <w:jc w:val="center"/>
-            </w:pPr>
-            <w:r>
-              <w:rPr>
-                <w:rFonts w:ascii="Arial" w:cs="Arial" w:eastAsia="Arial" w:hAnsi="Arial"/>
-                <w:i/>
-                <w:iCs/>
-                <w:color w:val="B0B8C8"/>
-                <w:sz w:val="22"/>
-                <w:szCs w:val="22"/>
-              </w:rPr>
-              <w:t xml:space="preserve">[ Insert Screenshot Here ]</w:t>
-            </w:r>
-          </w:p>
-          <w:p>
-            <w:pPr>
-              <w:spacing w:after="0"/>
-            </w:pPr>
-            <w:r>
-              <w:t xml:space="preserve"/>
-            </w:r>
-          </w:p>
-          <w:p>
-            <w:pPr>
-              <w:spacing w:after="0"/>
-            </w:pPr>
-            <w:r>
-              <w:t xml:space="preserve"/>
-            </w:r>
-          </w:p>
-          <w:p>
-            <w:pPr>
-              <w:spacing w:after="0"/>
-            </w:pPr>
-            <w:r>
-              <w:t xml:space="preserve"/>
-            </w:r>
-          </w:p>
-        </w:tc>
-      </w:tr>
-    </w:tbl>
-    <w:p>
-      <w:pPr>
-        <w:spacing w:after="260"/>
-      </w:pPr>
-      <w:r>
-        <w:t xml:space="preserve"/>
+        <w:t xml:space="preserve">Where: GCP Console → APIs &amp; Services → Enabled APIs</w:t>
+      </w:r>
+    </w:p>
+    <w:p>
+      <w:pPr>
+        <w:spacing w:after="300"/>
+        <w:jc w:val="center"/>
+      </w:pPr>
+      <w:r>
+        <w:drawing>
+          <wp:inline distT="0" distB="0" distL="0" distR="0">
+            <wp:extent cx="5619750" cy="3524250"/>
+            <wp:effectExtent t="0" r="0" b="0" l="0"/>
+            <wp:docPr id="1" name="screenshot-5" descr="Vertex AI — API enabled confirmation" title="Vertex AI — API enabled confirmation"/>
+            <wp:cNvGraphicFramePr>
+              <a:graphicFrameLocks xmlns:a="http://schemas.openxmlformats.org/drawingml/2006/main" noChangeAspect="1"/>
+            </wp:cNvGraphicFramePr>
+            <a:graphic xmlns:a="http://schemas.openxmlformats.org/drawingml/2006/main">
+              <a:graphicData uri="http://schemas.openxmlformats.org/drawingml/2006/picture">
+                <pic:pic xmlns:pic="http://schemas.openxmlformats.org/drawingml/2006/picture">
+                  <pic:nvPicPr>
+                    <pic:cNvPr id="0" name="" descr=""/>
+                    <pic:cNvPicPr>
+                      <a:picLocks noChangeAspect="1" noChangeArrowheads="1"/>
+                    </pic:cNvPicPr>
+                  </pic:nvPicPr>
+                  <pic:blipFill>
+                    <a:blip r:embed="rId13" cstate="none"/>
+                    <a:srcRect/>
+                    <a:stretch>
+                      <a:fillRect/>
+                    </a:stretch>
+                  </pic:blipFill>
+                  <pic:spPr bwMode="auto">
+                    <a:xfrm>
+                      <a:off x="0" y="0"/>
+                      <a:ext cx="5619750" cy="3524250"/>
+                    </a:xfrm>
+                    <a:prstGeom prst="rect">
+                      <a:avLst/>
+                    </a:prstGeom>
+                  </pic:spPr>
+                </pic:pic>
+              </a:graphicData>
+            </a:graphic>
+          </wp:inline>
+        </w:drawing>
       </w:r>
     </w:p>
     <w:p>
@@ -19710,7 +19376,7 @@
     </w:p>
     <w:p>
       <w:pPr>
-        <w:spacing w:after="80"/>
+        <w:spacing w:after="100"/>
       </w:pPr>
       <w:r>
         <w:rPr>
@@ -19721,116 +19387,53 @@
           <w:sz w:val="18"/>
           <w:szCs w:val="18"/>
         </w:rPr>
-        <w:t xml:space="preserve">Where to take it:  GCP Console → Pub/Sub → Topics (show genai-requests) then Subscriptions (show genai-worker-push)</w:t>
-      </w:r>
-    </w:p>
-    <w:tbl>
-      <w:tblPr>
-        <w:tblW w:type="dxa" w:w="9000"/>
-        <w:tblBorders>
-          <w:top w:val="single" w:color="auto" w:sz="4"/>
-          <w:left w:val="single" w:color="auto" w:sz="4"/>
-          <w:bottom w:val="single" w:color="auto" w:sz="4"/>
-          <w:right w:val="single" w:color="auto" w:sz="4"/>
-          <w:insideH w:val="single" w:color="auto" w:sz="4"/>
-          <w:insideV w:val="single" w:color="auto" w:sz="4"/>
-        </w:tblBorders>
-      </w:tblPr>
-      <w:tblGrid>
-        <w:gridCol w:w="9000"/>
-      </w:tblGrid>
-      <w:tr>
-        <w:tc>
-          <w:tcPr>
-            <w:tcW w:type="dxa" w:w="9000"/>
-            <w:tcBorders>
-              <w:top w:color="94A3B8" w:sz="6"/>
-              <w:left w:color="94A3B8" w:sz="6"/>
-              <w:bottom w:color="94A3B8" w:sz="6"/>
-              <w:right w:color="94A3B8" w:sz="6"/>
-            </w:tcBorders>
-            <w:shd w:fill="F7F9FC" w:val="clear"/>
-            <w:tcMar>
-              <w:top w:type="dxa" w:w="200"/>
-              <w:left w:type="dxa" w:w="160"/>
-              <w:bottom w:type="dxa" w:w="200"/>
-              <w:right w:type="dxa" w:w="160"/>
-            </w:tcMar>
-          </w:tcPr>
-          <w:p>
-            <w:pPr>
-              <w:spacing w:after="0"/>
-            </w:pPr>
-            <w:r>
-              <w:t xml:space="preserve"/>
-            </w:r>
-          </w:p>
-          <w:p>
-            <w:pPr>
-              <w:spacing w:after="0"/>
-            </w:pPr>
-            <w:r>
-              <w:t xml:space="preserve"/>
-            </w:r>
-          </w:p>
-          <w:p>
-            <w:pPr>
-              <w:spacing w:after="0"/>
-            </w:pPr>
-            <w:r>
-              <w:t xml:space="preserve"/>
-            </w:r>
-          </w:p>
-          <w:p>
-            <w:pPr>
-              <w:spacing w:after="0"/>
-              <w:jc w:val="center"/>
-            </w:pPr>
-            <w:r>
-              <w:rPr>
-                <w:rFonts w:ascii="Arial" w:cs="Arial" w:eastAsia="Arial" w:hAnsi="Arial"/>
-                <w:i/>
-                <w:iCs/>
-                <w:color w:val="B0B8C8"/>
-                <w:sz w:val="22"/>
-                <w:szCs w:val="22"/>
-              </w:rPr>
-              <w:t xml:space="preserve">[ Insert Screenshot Here ]</w:t>
-            </w:r>
-          </w:p>
-          <w:p>
-            <w:pPr>
-              <w:spacing w:after="0"/>
-            </w:pPr>
-            <w:r>
-              <w:t xml:space="preserve"/>
-            </w:r>
-          </w:p>
-          <w:p>
-            <w:pPr>
-              <w:spacing w:after="0"/>
-            </w:pPr>
-            <w:r>
-              <w:t xml:space="preserve"/>
-            </w:r>
-          </w:p>
-          <w:p>
-            <w:pPr>
-              <w:spacing w:after="0"/>
-            </w:pPr>
-            <w:r>
-              <w:t xml:space="preserve"/>
-            </w:r>
-          </w:p>
-        </w:tc>
-      </w:tr>
-    </w:tbl>
-    <w:p>
-      <w:pPr>
-        <w:spacing w:after="260"/>
-      </w:pPr>
-      <w:r>
-        <w:t xml:space="preserve"/>
+        <w:t xml:space="preserve">Where: GCP Console → Pub/Sub</w:t>
+      </w:r>
+    </w:p>
+    <w:p>
+      <w:pPr>
+        <w:spacing w:after="300"/>
+        <w:jc w:val="center"/>
+      </w:pPr>
+      <w:r>
+        <w:drawing>
+          <wp:inline distT="0" distB="0" distL="0" distR="0">
+            <wp:extent cx="5619750" cy="3524250"/>
+            <wp:effectExtent t="0" r="0" b="0" l="0"/>
+            <wp:docPr id="1" name="screenshot-6" descr="Pub/Sub — genai-requests topic and genai-worker-push subscription" title="Pub/Sub — genai-requests topic and genai-worker-push subscription"/>
+            <wp:cNvGraphicFramePr>
+              <a:graphicFrameLocks xmlns:a="http://schemas.openxmlformats.org/drawingml/2006/main" noChangeAspect="1"/>
+            </wp:cNvGraphicFramePr>
+            <a:graphic xmlns:a="http://schemas.openxmlformats.org/drawingml/2006/main">
+              <a:graphicData uri="http://schemas.openxmlformats.org/drawingml/2006/picture">
+                <pic:pic xmlns:pic="http://schemas.openxmlformats.org/drawingml/2006/picture">
+                  <pic:nvPicPr>
+                    <pic:cNvPr id="0" name="" descr=""/>
+                    <pic:cNvPicPr>
+                      <a:picLocks noChangeAspect="1" noChangeArrowheads="1"/>
+                    </pic:cNvPicPr>
+                  </pic:nvPicPr>
+                  <pic:blipFill>
+                    <a:blip r:embed="rId14" cstate="none"/>
+                    <a:srcRect/>
+                    <a:stretch>
+                      <a:fillRect/>
+                    </a:stretch>
+                  </pic:blipFill>
+                  <pic:spPr bwMode="auto">
+                    <a:xfrm>
+                      <a:off x="0" y="0"/>
+                      <a:ext cx="5619750" cy="3524250"/>
+                    </a:xfrm>
+                    <a:prstGeom prst="rect">
+                      <a:avLst/>
+                    </a:prstGeom>
+                  </pic:spPr>
+                </pic:pic>
+              </a:graphicData>
+            </a:graphic>
+          </wp:inline>
+        </w:drawing>
       </w:r>
     </w:p>
     <w:p>
@@ -19857,12 +19460,12 @@
           <w:sz w:val="22"/>
           <w:szCs w:val="22"/>
         </w:rPr>
-        <w:t xml:space="preserve">Frontend — Weather section showing weather for a city (e.g. Riyadh)</w:t>
-      </w:r>
-    </w:p>
-    <w:p>
-      <w:pPr>
-        <w:spacing w:after="80"/>
+        <w:t xml:space="preserve">Frontend — Weather section showing weather for a city</w:t>
+      </w:r>
+    </w:p>
+    <w:p>
+      <w:pPr>
+        <w:spacing w:after="100"/>
       </w:pPr>
       <w:r>
         <w:rPr>
@@ -19873,116 +19476,53 @@
           <w:sz w:val="18"/>
           <w:szCs w:val="18"/>
         </w:rPr>
-        <w:t xml:space="preserve">Where to take it:  Browser → https://frontend-180225892893.us-central1.run.app → search a city</w:t>
-      </w:r>
-    </w:p>
-    <w:tbl>
-      <w:tblPr>
-        <w:tblW w:type="dxa" w:w="9000"/>
-        <w:tblBorders>
-          <w:top w:val="single" w:color="auto" w:sz="4"/>
-          <w:left w:val="single" w:color="auto" w:sz="4"/>
-          <w:bottom w:val="single" w:color="auto" w:sz="4"/>
-          <w:right w:val="single" w:color="auto" w:sz="4"/>
-          <w:insideH w:val="single" w:color="auto" w:sz="4"/>
-          <w:insideV w:val="single" w:color="auto" w:sz="4"/>
-        </w:tblBorders>
-      </w:tblPr>
-      <w:tblGrid>
-        <w:gridCol w:w="9000"/>
-      </w:tblGrid>
-      <w:tr>
-        <w:tc>
-          <w:tcPr>
-            <w:tcW w:type="dxa" w:w="9000"/>
-            <w:tcBorders>
-              <w:top w:color="94A3B8" w:sz="6"/>
-              <w:left w:color="94A3B8" w:sz="6"/>
-              <w:bottom w:color="94A3B8" w:sz="6"/>
-              <w:right w:color="94A3B8" w:sz="6"/>
-            </w:tcBorders>
-            <w:shd w:fill="F7F9FC" w:val="clear"/>
-            <w:tcMar>
-              <w:top w:type="dxa" w:w="200"/>
-              <w:left w:type="dxa" w:w="160"/>
-              <w:bottom w:type="dxa" w:w="200"/>
-              <w:right w:type="dxa" w:w="160"/>
-            </w:tcMar>
-          </w:tcPr>
-          <w:p>
-            <w:pPr>
-              <w:spacing w:after="0"/>
-            </w:pPr>
-            <w:r>
-              <w:t xml:space="preserve"/>
-            </w:r>
-          </w:p>
-          <w:p>
-            <w:pPr>
-              <w:spacing w:after="0"/>
-            </w:pPr>
-            <w:r>
-              <w:t xml:space="preserve"/>
-            </w:r>
-          </w:p>
-          <w:p>
-            <w:pPr>
-              <w:spacing w:after="0"/>
-            </w:pPr>
-            <w:r>
-              <w:t xml:space="preserve"/>
-            </w:r>
-          </w:p>
-          <w:p>
-            <w:pPr>
-              <w:spacing w:after="0"/>
-              <w:jc w:val="center"/>
-            </w:pPr>
-            <w:r>
-              <w:rPr>
-                <w:rFonts w:ascii="Arial" w:cs="Arial" w:eastAsia="Arial" w:hAnsi="Arial"/>
-                <w:i/>
-                <w:iCs/>
-                <w:color w:val="B0B8C8"/>
-                <w:sz w:val="22"/>
-                <w:szCs w:val="22"/>
-              </w:rPr>
-              <w:t xml:space="preserve">[ Insert Screenshot Here ]</w:t>
-            </w:r>
-          </w:p>
-          <w:p>
-            <w:pPr>
-              <w:spacing w:after="0"/>
-            </w:pPr>
-            <w:r>
-              <w:t xml:space="preserve"/>
-            </w:r>
-          </w:p>
-          <w:p>
-            <w:pPr>
-              <w:spacing w:after="0"/>
-            </w:pPr>
-            <w:r>
-              <w:t xml:space="preserve"/>
-            </w:r>
-          </w:p>
-          <w:p>
-            <w:pPr>
-              <w:spacing w:after="0"/>
-            </w:pPr>
-            <w:r>
-              <w:t xml:space="preserve"/>
-            </w:r>
-          </w:p>
-        </w:tc>
-      </w:tr>
-    </w:tbl>
-    <w:p>
-      <w:pPr>
-        <w:spacing w:after="260"/>
-      </w:pPr>
-      <w:r>
-        <w:t xml:space="preserve"/>
+        <w:t xml:space="preserve">Where: Browser → Frontend App</w:t>
+      </w:r>
+    </w:p>
+    <w:p>
+      <w:pPr>
+        <w:spacing w:after="300"/>
+        <w:jc w:val="center"/>
+      </w:pPr>
+      <w:r>
+        <w:drawing>
+          <wp:inline distT="0" distB="0" distL="0" distR="0">
+            <wp:extent cx="5619750" cy="3524250"/>
+            <wp:effectExtent t="0" r="0" b="0" l="0"/>
+            <wp:docPr id="1" name="screenshot-7" descr="Frontend — Weather section showing weather for a city" title="Frontend — Weather section showing weather for a city"/>
+            <wp:cNvGraphicFramePr>
+              <a:graphicFrameLocks xmlns:a="http://schemas.openxmlformats.org/drawingml/2006/main" noChangeAspect="1"/>
+            </wp:cNvGraphicFramePr>
+            <a:graphic xmlns:a="http://schemas.openxmlformats.org/drawingml/2006/main">
+              <a:graphicData uri="http://schemas.openxmlformats.org/drawingml/2006/picture">
+                <pic:pic xmlns:pic="http://schemas.openxmlformats.org/drawingml/2006/picture">
+                  <pic:nvPicPr>
+                    <pic:cNvPr id="0" name="" descr=""/>
+                    <pic:cNvPicPr>
+                      <a:picLocks noChangeAspect="1" noChangeArrowheads="1"/>
+                    </pic:cNvPicPr>
+                  </pic:nvPicPr>
+                  <pic:blipFill>
+                    <a:blip r:embed="rId15" cstate="none"/>
+                    <a:srcRect/>
+                    <a:stretch>
+                      <a:fillRect/>
+                    </a:stretch>
+                  </pic:blipFill>
+                  <pic:spPr bwMode="auto">
+                    <a:xfrm>
+                      <a:off x="0" y="0"/>
+                      <a:ext cx="5619750" cy="3524250"/>
+                    </a:xfrm>
+                    <a:prstGeom prst="rect">
+                      <a:avLst/>
+                    </a:prstGeom>
+                  </pic:spPr>
+                </pic:pic>
+              </a:graphicData>
+            </a:graphic>
+          </wp:inline>
+        </w:drawing>
       </w:r>
     </w:p>
     <w:p>
@@ -20009,12 +19549,12 @@
           <w:sz w:val="22"/>
           <w:szCs w:val="22"/>
         </w:rPr>
-        <w:t xml:space="preserve">Frontend — AI image generation: prompt entered and image generated</w:t>
-      </w:r>
-    </w:p>
-    <w:p>
-      <w:pPr>
-        <w:spacing w:after="80"/>
+        <w:t xml:space="preserve">Frontend — AI image generation with prompt and result</w:t>
+      </w:r>
+    </w:p>
+    <w:p>
+      <w:pPr>
+        <w:spacing w:after="100"/>
       </w:pPr>
       <w:r>
         <w:rPr>
@@ -20025,116 +19565,53 @@
           <w:sz w:val="18"/>
           <w:szCs w:val="18"/>
         </w:rPr>
-        <w:t xml:space="preserve">Where to take it:  Browser → Frontend → type a prompt → click Generate → wait for result</w:t>
-      </w:r>
-    </w:p>
-    <w:tbl>
-      <w:tblPr>
-        <w:tblW w:type="dxa" w:w="9000"/>
-        <w:tblBorders>
-          <w:top w:val="single" w:color="auto" w:sz="4"/>
-          <w:left w:val="single" w:color="auto" w:sz="4"/>
-          <w:bottom w:val="single" w:color="auto" w:sz="4"/>
-          <w:right w:val="single" w:color="auto" w:sz="4"/>
-          <w:insideH w:val="single" w:color="auto" w:sz="4"/>
-          <w:insideV w:val="single" w:color="auto" w:sz="4"/>
-        </w:tblBorders>
-      </w:tblPr>
-      <w:tblGrid>
-        <w:gridCol w:w="9000"/>
-      </w:tblGrid>
-      <w:tr>
-        <w:tc>
-          <w:tcPr>
-            <w:tcW w:type="dxa" w:w="9000"/>
-            <w:tcBorders>
-              <w:top w:color="94A3B8" w:sz="6"/>
-              <w:left w:color="94A3B8" w:sz="6"/>
-              <w:bottom w:color="94A3B8" w:sz="6"/>
-              <w:right w:color="94A3B8" w:sz="6"/>
-            </w:tcBorders>
-            <w:shd w:fill="F7F9FC" w:val="clear"/>
-            <w:tcMar>
-              <w:top w:type="dxa" w:w="200"/>
-              <w:left w:type="dxa" w:w="160"/>
-              <w:bottom w:type="dxa" w:w="200"/>
-              <w:right w:type="dxa" w:w="160"/>
-            </w:tcMar>
-          </w:tcPr>
-          <w:p>
-            <w:pPr>
-              <w:spacing w:after="0"/>
-            </w:pPr>
-            <w:r>
-              <w:t xml:space="preserve"/>
-            </w:r>
-          </w:p>
-          <w:p>
-            <w:pPr>
-              <w:spacing w:after="0"/>
-            </w:pPr>
-            <w:r>
-              <w:t xml:space="preserve"/>
-            </w:r>
-          </w:p>
-          <w:p>
-            <w:pPr>
-              <w:spacing w:after="0"/>
-            </w:pPr>
-            <w:r>
-              <w:t xml:space="preserve"/>
-            </w:r>
-          </w:p>
-          <w:p>
-            <w:pPr>
-              <w:spacing w:after="0"/>
-              <w:jc w:val="center"/>
-            </w:pPr>
-            <w:r>
-              <w:rPr>
-                <w:rFonts w:ascii="Arial" w:cs="Arial" w:eastAsia="Arial" w:hAnsi="Arial"/>
-                <w:i/>
-                <w:iCs/>
-                <w:color w:val="B0B8C8"/>
-                <w:sz w:val="22"/>
-                <w:szCs w:val="22"/>
-              </w:rPr>
-              <w:t xml:space="preserve">[ Insert Screenshot Here ]</w:t>
-            </w:r>
-          </w:p>
-          <w:p>
-            <w:pPr>
-              <w:spacing w:after="0"/>
-            </w:pPr>
-            <w:r>
-              <w:t xml:space="preserve"/>
-            </w:r>
-          </w:p>
-          <w:p>
-            <w:pPr>
-              <w:spacing w:after="0"/>
-            </w:pPr>
-            <w:r>
-              <w:t xml:space="preserve"/>
-            </w:r>
-          </w:p>
-          <w:p>
-            <w:pPr>
-              <w:spacing w:after="0"/>
-            </w:pPr>
-            <w:r>
-              <w:t xml:space="preserve"/>
-            </w:r>
-          </w:p>
-        </w:tc>
-      </w:tr>
-    </w:tbl>
-    <w:p>
-      <w:pPr>
-        <w:spacing w:after="260"/>
-      </w:pPr>
-      <w:r>
-        <w:t xml:space="preserve"/>
+        <w:t xml:space="preserve">Where: Browser → Frontend App → Generate Image</w:t>
+      </w:r>
+    </w:p>
+    <w:p>
+      <w:pPr>
+        <w:spacing w:after="300"/>
+        <w:jc w:val="center"/>
+      </w:pPr>
+      <w:r>
+        <w:drawing>
+          <wp:inline distT="0" distB="0" distL="0" distR="0">
+            <wp:extent cx="5619750" cy="3524250"/>
+            <wp:effectExtent t="0" r="0" b="0" l="0"/>
+            <wp:docPr id="1" name="screenshot-8" descr="Frontend — AI image generation with prompt and result" title="Frontend — AI image generation with prompt and result"/>
+            <wp:cNvGraphicFramePr>
+              <a:graphicFrameLocks xmlns:a="http://schemas.openxmlformats.org/drawingml/2006/main" noChangeAspect="1"/>
+            </wp:cNvGraphicFramePr>
+            <a:graphic xmlns:a="http://schemas.openxmlformats.org/drawingml/2006/main">
+              <a:graphicData uri="http://schemas.openxmlformats.org/drawingml/2006/picture">
+                <pic:pic xmlns:pic="http://schemas.openxmlformats.org/drawingml/2006/picture">
+                  <pic:nvPicPr>
+                    <pic:cNvPr id="0" name="" descr=""/>
+                    <pic:cNvPicPr>
+                      <a:picLocks noChangeAspect="1" noChangeArrowheads="1"/>
+                    </pic:cNvPicPr>
+                  </pic:nvPicPr>
+                  <pic:blipFill>
+                    <a:blip r:embed="rId16" cstate="none"/>
+                    <a:srcRect/>
+                    <a:stretch>
+                      <a:fillRect/>
+                    </a:stretch>
+                  </pic:blipFill>
+                  <pic:spPr bwMode="auto">
+                    <a:xfrm>
+                      <a:off x="0" y="0"/>
+                      <a:ext cx="5619750" cy="3524250"/>
+                    </a:xfrm>
+                    <a:prstGeom prst="rect">
+                      <a:avLst/>
+                    </a:prstGeom>
+                  </pic:spPr>
+                </pic:pic>
+              </a:graphicData>
+            </a:graphic>
+          </wp:inline>
+        </w:drawing>
       </w:r>
     </w:p>
     <w:p>
@@ -20161,12 +19638,12 @@
           <w:sz w:val="22"/>
           <w:szCs w:val="22"/>
         </w:rPr>
-        <w:t xml:space="preserve">Frontend — History gallery with multiple saved AI images</w:t>
-      </w:r>
-    </w:p>
-    <w:p>
-      <w:pPr>
-        <w:spacing w:after="80"/>
+        <w:t xml:space="preserve">Frontend — History gallery with saved AI images</w:t>
+      </w:r>
+    </w:p>
+    <w:p>
+      <w:pPr>
+        <w:spacing w:after="100"/>
       </w:pPr>
       <w:r>
         <w:rPr>
@@ -20177,116 +19654,53 @@
           <w:sz w:val="18"/>
           <w:szCs w:val="18"/>
         </w:rPr>
-        <w:t xml:space="preserve">Where to take it:  Browser → Frontend → History section (after saving 2–3 images)</w:t>
-      </w:r>
-    </w:p>
-    <w:tbl>
-      <w:tblPr>
-        <w:tblW w:type="dxa" w:w="9000"/>
-        <w:tblBorders>
-          <w:top w:val="single" w:color="auto" w:sz="4"/>
-          <w:left w:val="single" w:color="auto" w:sz="4"/>
-          <w:bottom w:val="single" w:color="auto" w:sz="4"/>
-          <w:right w:val="single" w:color="auto" w:sz="4"/>
-          <w:insideH w:val="single" w:color="auto" w:sz="4"/>
-          <w:insideV w:val="single" w:color="auto" w:sz="4"/>
-        </w:tblBorders>
-      </w:tblPr>
-      <w:tblGrid>
-        <w:gridCol w:w="9000"/>
-      </w:tblGrid>
-      <w:tr>
-        <w:tc>
-          <w:tcPr>
-            <w:tcW w:type="dxa" w:w="9000"/>
-            <w:tcBorders>
-              <w:top w:color="94A3B8" w:sz="6"/>
-              <w:left w:color="94A3B8" w:sz="6"/>
-              <w:bottom w:color="94A3B8" w:sz="6"/>
-              <w:right w:color="94A3B8" w:sz="6"/>
-            </w:tcBorders>
-            <w:shd w:fill="F7F9FC" w:val="clear"/>
-            <w:tcMar>
-              <w:top w:type="dxa" w:w="200"/>
-              <w:left w:type="dxa" w:w="160"/>
-              <w:bottom w:type="dxa" w:w="200"/>
-              <w:right w:type="dxa" w:w="160"/>
-            </w:tcMar>
-          </w:tcPr>
-          <w:p>
-            <w:pPr>
-              <w:spacing w:after="0"/>
-            </w:pPr>
-            <w:r>
-              <w:t xml:space="preserve"/>
-            </w:r>
-          </w:p>
-          <w:p>
-            <w:pPr>
-              <w:spacing w:after="0"/>
-            </w:pPr>
-            <w:r>
-              <w:t xml:space="preserve"/>
-            </w:r>
-          </w:p>
-          <w:p>
-            <w:pPr>
-              <w:spacing w:after="0"/>
-            </w:pPr>
-            <w:r>
-              <w:t xml:space="preserve"/>
-            </w:r>
-          </w:p>
-          <w:p>
-            <w:pPr>
-              <w:spacing w:after="0"/>
-              <w:jc w:val="center"/>
-            </w:pPr>
-            <w:r>
-              <w:rPr>
-                <w:rFonts w:ascii="Arial" w:cs="Arial" w:eastAsia="Arial" w:hAnsi="Arial"/>
-                <w:i/>
-                <w:iCs/>
-                <w:color w:val="B0B8C8"/>
-                <w:sz w:val="22"/>
-                <w:szCs w:val="22"/>
-              </w:rPr>
-              <w:t xml:space="preserve">[ Insert Screenshot Here ]</w:t>
-            </w:r>
-          </w:p>
-          <w:p>
-            <w:pPr>
-              <w:spacing w:after="0"/>
-            </w:pPr>
-            <w:r>
-              <w:t xml:space="preserve"/>
-            </w:r>
-          </w:p>
-          <w:p>
-            <w:pPr>
-              <w:spacing w:after="0"/>
-            </w:pPr>
-            <w:r>
-              <w:t xml:space="preserve"/>
-            </w:r>
-          </w:p>
-          <w:p>
-            <w:pPr>
-              <w:spacing w:after="0"/>
-            </w:pPr>
-            <w:r>
-              <w:t xml:space="preserve"/>
-            </w:r>
-          </w:p>
-        </w:tc>
-      </w:tr>
-    </w:tbl>
-    <w:p>
-      <w:pPr>
-        <w:spacing w:after="260"/>
-      </w:pPr>
-      <w:r>
-        <w:t xml:space="preserve"/>
+        <w:t xml:space="preserve">Where: Browser → Frontend App → History</w:t>
+      </w:r>
+    </w:p>
+    <w:p>
+      <w:pPr>
+        <w:spacing w:after="300"/>
+        <w:jc w:val="center"/>
+      </w:pPr>
+      <w:r>
+        <w:drawing>
+          <wp:inline distT="0" distB="0" distL="0" distR="0">
+            <wp:extent cx="5619750" cy="3524250"/>
+            <wp:effectExtent t="0" r="0" b="0" l="0"/>
+            <wp:docPr id="1" name="screenshot-9" descr="Frontend — History gallery with saved AI images" title="Frontend — History gallery with saved AI images"/>
+            <wp:cNvGraphicFramePr>
+              <a:graphicFrameLocks xmlns:a="http://schemas.openxmlformats.org/drawingml/2006/main" noChangeAspect="1"/>
+            </wp:cNvGraphicFramePr>
+            <a:graphic xmlns:a="http://schemas.openxmlformats.org/drawingml/2006/main">
+              <a:graphicData uri="http://schemas.openxmlformats.org/drawingml/2006/picture">
+                <pic:pic xmlns:pic="http://schemas.openxmlformats.org/drawingml/2006/picture">
+                  <pic:nvPicPr>
+                    <pic:cNvPr id="0" name="" descr=""/>
+                    <pic:cNvPicPr>
+                      <a:picLocks noChangeAspect="1" noChangeArrowheads="1"/>
+                    </pic:cNvPicPr>
+                  </pic:nvPicPr>
+                  <pic:blipFill>
+                    <a:blip r:embed="rId17" cstate="none"/>
+                    <a:srcRect/>
+                    <a:stretch>
+                      <a:fillRect/>
+                    </a:stretch>
+                  </pic:blipFill>
+                  <pic:spPr bwMode="auto">
+                    <a:xfrm>
+                      <a:off x="0" y="0"/>
+                      <a:ext cx="5619750" cy="3524250"/>
+                    </a:xfrm>
+                    <a:prstGeom prst="rect">
+                      <a:avLst/>
+                    </a:prstGeom>
+                  </pic:spPr>
+                </pic:pic>
+              </a:graphicData>
+            </a:graphic>
+          </wp:inline>
+        </w:drawing>
       </w:r>
     </w:p>
     <w:p>
@@ -20313,12 +19727,12 @@
           <w:sz w:val="22"/>
           <w:szCs w:val="22"/>
         </w:rPr>
-        <w:t xml:space="preserve">Swagger UI — All three API service tabs (S1, S2, S3)</w:t>
-      </w:r>
-    </w:p>
-    <w:p>
-      <w:pPr>
-        <w:spacing w:after="80"/>
+        <w:t xml:space="preserve">Swagger UI — API documentation all three services</w:t>
+      </w:r>
+    </w:p>
+    <w:p>
+      <w:pPr>
+        <w:spacing w:after="100"/>
       </w:pPr>
       <w:r>
         <w:rPr>
@@ -20329,116 +19743,53 @@
           <w:sz w:val="18"/>
           <w:szCs w:val="18"/>
         </w:rPr>
-        <w:t xml:space="preserve">Where to take it:  Browser → https://swagger-ui-180225892893.us-central1.run.app</w:t>
-      </w:r>
-    </w:p>
-    <w:tbl>
-      <w:tblPr>
-        <w:tblW w:type="dxa" w:w="9000"/>
-        <w:tblBorders>
-          <w:top w:val="single" w:color="auto" w:sz="4"/>
-          <w:left w:val="single" w:color="auto" w:sz="4"/>
-          <w:bottom w:val="single" w:color="auto" w:sz="4"/>
-          <w:right w:val="single" w:color="auto" w:sz="4"/>
-          <w:insideH w:val="single" w:color="auto" w:sz="4"/>
-          <w:insideV w:val="single" w:color="auto" w:sz="4"/>
-        </w:tblBorders>
-      </w:tblPr>
-      <w:tblGrid>
-        <w:gridCol w:w="9000"/>
-      </w:tblGrid>
-      <w:tr>
-        <w:tc>
-          <w:tcPr>
-            <w:tcW w:type="dxa" w:w="9000"/>
-            <w:tcBorders>
-              <w:top w:color="94A3B8" w:sz="6"/>
-              <w:left w:color="94A3B8" w:sz="6"/>
-              <w:bottom w:color="94A3B8" w:sz="6"/>
-              <w:right w:color="94A3B8" w:sz="6"/>
-            </w:tcBorders>
-            <w:shd w:fill="F7F9FC" w:val="clear"/>
-            <w:tcMar>
-              <w:top w:type="dxa" w:w="200"/>
-              <w:left w:type="dxa" w:w="160"/>
-              <w:bottom w:type="dxa" w:w="200"/>
-              <w:right w:type="dxa" w:w="160"/>
-            </w:tcMar>
-          </w:tcPr>
-          <w:p>
-            <w:pPr>
-              <w:spacing w:after="0"/>
-            </w:pPr>
-            <w:r>
-              <w:t xml:space="preserve"/>
-            </w:r>
-          </w:p>
-          <w:p>
-            <w:pPr>
-              <w:spacing w:after="0"/>
-            </w:pPr>
-            <w:r>
-              <w:t xml:space="preserve"/>
-            </w:r>
-          </w:p>
-          <w:p>
-            <w:pPr>
-              <w:spacing w:after="0"/>
-            </w:pPr>
-            <w:r>
-              <w:t xml:space="preserve"/>
-            </w:r>
-          </w:p>
-          <w:p>
-            <w:pPr>
-              <w:spacing w:after="0"/>
-              <w:jc w:val="center"/>
-            </w:pPr>
-            <w:r>
-              <w:rPr>
-                <w:rFonts w:ascii="Arial" w:cs="Arial" w:eastAsia="Arial" w:hAnsi="Arial"/>
-                <w:i/>
-                <w:iCs/>
-                <w:color w:val="B0B8C8"/>
-                <w:sz w:val="22"/>
-                <w:szCs w:val="22"/>
-              </w:rPr>
-              <w:t xml:space="preserve">[ Insert Screenshot Here ]</w:t>
-            </w:r>
-          </w:p>
-          <w:p>
-            <w:pPr>
-              <w:spacing w:after="0"/>
-            </w:pPr>
-            <w:r>
-              <w:t xml:space="preserve"/>
-            </w:r>
-          </w:p>
-          <w:p>
-            <w:pPr>
-              <w:spacing w:after="0"/>
-            </w:pPr>
-            <w:r>
-              <w:t xml:space="preserve"/>
-            </w:r>
-          </w:p>
-          <w:p>
-            <w:pPr>
-              <w:spacing w:after="0"/>
-            </w:pPr>
-            <w:r>
-              <w:t xml:space="preserve"/>
-            </w:r>
-          </w:p>
-        </w:tc>
-      </w:tr>
-    </w:tbl>
-    <w:p>
-      <w:pPr>
-        <w:spacing w:after="260"/>
-      </w:pPr>
-      <w:r>
-        <w:t xml:space="preserve"/>
+        <w:t xml:space="preserve">Where: Browser → Swagger UI</w:t>
+      </w:r>
+    </w:p>
+    <w:p>
+      <w:pPr>
+        <w:spacing w:after="300"/>
+        <w:jc w:val="center"/>
+      </w:pPr>
+      <w:r>
+        <w:drawing>
+          <wp:inline distT="0" distB="0" distL="0" distR="0">
+            <wp:extent cx="5619750" cy="3524250"/>
+            <wp:effectExtent t="0" r="0" b="0" l="0"/>
+            <wp:docPr id="1" name="screenshot-10" descr="Swagger UI — API documentation all three services" title="Swagger UI — API documentation all three services"/>
+            <wp:cNvGraphicFramePr>
+              <a:graphicFrameLocks xmlns:a="http://schemas.openxmlformats.org/drawingml/2006/main" noChangeAspect="1"/>
+            </wp:cNvGraphicFramePr>
+            <a:graphic xmlns:a="http://schemas.openxmlformats.org/drawingml/2006/main">
+              <a:graphicData uri="http://schemas.openxmlformats.org/drawingml/2006/picture">
+                <pic:pic xmlns:pic="http://schemas.openxmlformats.org/drawingml/2006/picture">
+                  <pic:nvPicPr>
+                    <pic:cNvPr id="0" name="" descr=""/>
+                    <pic:cNvPicPr>
+                      <a:picLocks noChangeAspect="1" noChangeArrowheads="1"/>
+                    </pic:cNvPicPr>
+                  </pic:nvPicPr>
+                  <pic:blipFill>
+                    <a:blip r:embed="rId18" cstate="none"/>
+                    <a:srcRect/>
+                    <a:stretch>
+                      <a:fillRect/>
+                    </a:stretch>
+                  </pic:blipFill>
+                  <pic:spPr bwMode="auto">
+                    <a:xfrm>
+                      <a:off x="0" y="0"/>
+                      <a:ext cx="5619750" cy="3524250"/>
+                    </a:xfrm>
+                    <a:prstGeom prst="rect">
+                      <a:avLst/>
+                    </a:prstGeom>
+                  </pic:spPr>
+                </pic:pic>
+              </a:graphicData>
+            </a:graphic>
+          </wp:inline>
+        </w:drawing>
       </w:r>
     </w:p>
     <w:p>
@@ -20470,7 +19821,7 @@
     </w:p>
     <w:p>
       <w:pPr>
-        <w:spacing w:after="80"/>
+        <w:spacing w:after="100"/>
       </w:pPr>
       <w:r>
         <w:rPr>
@@ -20481,116 +19832,53 @@
           <w:sz w:val="18"/>
           <w:szCs w:val="18"/>
         </w:rPr>
-        <w:t xml:space="preserve">Where to take it:  Browser → https://graphql-service-180225892893.us-central1.run.app/graphql → run: query { weather(city:"Riyadh") { temp_c condition } }</w:t>
-      </w:r>
-    </w:p>
-    <w:tbl>
-      <w:tblPr>
-        <w:tblW w:type="dxa" w:w="9000"/>
-        <w:tblBorders>
-          <w:top w:val="single" w:color="auto" w:sz="4"/>
-          <w:left w:val="single" w:color="auto" w:sz="4"/>
-          <w:bottom w:val="single" w:color="auto" w:sz="4"/>
-          <w:right w:val="single" w:color="auto" w:sz="4"/>
-          <w:insideH w:val="single" w:color="auto" w:sz="4"/>
-          <w:insideV w:val="single" w:color="auto" w:sz="4"/>
-        </w:tblBorders>
-      </w:tblPr>
-      <w:tblGrid>
-        <w:gridCol w:w="9000"/>
-      </w:tblGrid>
-      <w:tr>
-        <w:tc>
-          <w:tcPr>
-            <w:tcW w:type="dxa" w:w="9000"/>
-            <w:tcBorders>
-              <w:top w:color="94A3B8" w:sz="6"/>
-              <w:left w:color="94A3B8" w:sz="6"/>
-              <w:bottom w:color="94A3B8" w:sz="6"/>
-              <w:right w:color="94A3B8" w:sz="6"/>
-            </w:tcBorders>
-            <w:shd w:fill="F7F9FC" w:val="clear"/>
-            <w:tcMar>
-              <w:top w:type="dxa" w:w="200"/>
-              <w:left w:type="dxa" w:w="160"/>
-              <w:bottom w:type="dxa" w:w="200"/>
-              <w:right w:type="dxa" w:w="160"/>
-            </w:tcMar>
-          </w:tcPr>
-          <w:p>
-            <w:pPr>
-              <w:spacing w:after="0"/>
-            </w:pPr>
-            <w:r>
-              <w:t xml:space="preserve"/>
-            </w:r>
-          </w:p>
-          <w:p>
-            <w:pPr>
-              <w:spacing w:after="0"/>
-            </w:pPr>
-            <w:r>
-              <w:t xml:space="preserve"/>
-            </w:r>
-          </w:p>
-          <w:p>
-            <w:pPr>
-              <w:spacing w:after="0"/>
-            </w:pPr>
-            <w:r>
-              <w:t xml:space="preserve"/>
-            </w:r>
-          </w:p>
-          <w:p>
-            <w:pPr>
-              <w:spacing w:after="0"/>
-              <w:jc w:val="center"/>
-            </w:pPr>
-            <w:r>
-              <w:rPr>
-                <w:rFonts w:ascii="Arial" w:cs="Arial" w:eastAsia="Arial" w:hAnsi="Arial"/>
-                <w:i/>
-                <w:iCs/>
-                <w:color w:val="B0B8C8"/>
-                <w:sz w:val="22"/>
-                <w:szCs w:val="22"/>
-              </w:rPr>
-              <w:t xml:space="preserve">[ Insert Screenshot Here ]</w:t>
-            </w:r>
-          </w:p>
-          <w:p>
-            <w:pPr>
-              <w:spacing w:after="0"/>
-            </w:pPr>
-            <w:r>
-              <w:t xml:space="preserve"/>
-            </w:r>
-          </w:p>
-          <w:p>
-            <w:pPr>
-              <w:spacing w:after="0"/>
-            </w:pPr>
-            <w:r>
-              <w:t xml:space="preserve"/>
-            </w:r>
-          </w:p>
-          <w:p>
-            <w:pPr>
-              <w:spacing w:after="0"/>
-            </w:pPr>
-            <w:r>
-              <w:t xml:space="preserve"/>
-            </w:r>
-          </w:p>
-        </w:tc>
-      </w:tr>
-    </w:tbl>
-    <w:p>
-      <w:pPr>
-        <w:spacing w:after="260"/>
-      </w:pPr>
-      <w:r>
-        <w:t xml:space="preserve"/>
+        <w:t xml:space="preserve">Where: Browser → GraphQL Service /graphql</w:t>
+      </w:r>
+    </w:p>
+    <w:p>
+      <w:pPr>
+        <w:spacing w:after="300"/>
+        <w:jc w:val="center"/>
+      </w:pPr>
+      <w:r>
+        <w:drawing>
+          <wp:inline distT="0" distB="0" distL="0" distR="0">
+            <wp:extent cx="5619750" cy="3524250"/>
+            <wp:effectExtent t="0" r="0" b="0" l="0"/>
+            <wp:docPr id="1" name="screenshot-11" descr="GraphiQL — Running a weather query in the browser IDE" title="GraphiQL — Running a weather query in the browser IDE"/>
+            <wp:cNvGraphicFramePr>
+              <a:graphicFrameLocks xmlns:a="http://schemas.openxmlformats.org/drawingml/2006/main" noChangeAspect="1"/>
+            </wp:cNvGraphicFramePr>
+            <a:graphic xmlns:a="http://schemas.openxmlformats.org/drawingml/2006/main">
+              <a:graphicData uri="http://schemas.openxmlformats.org/drawingml/2006/picture">
+                <pic:pic xmlns:pic="http://schemas.openxmlformats.org/drawingml/2006/picture">
+                  <pic:nvPicPr>
+                    <pic:cNvPr id="0" name="" descr=""/>
+                    <pic:cNvPicPr>
+                      <a:picLocks noChangeAspect="1" noChangeArrowheads="1"/>
+                    </pic:cNvPicPr>
+                  </pic:nvPicPr>
+                  <pic:blipFill>
+                    <a:blip r:embed="rId19" cstate="none"/>
+                    <a:srcRect/>
+                    <a:stretch>
+                      <a:fillRect/>
+                    </a:stretch>
+                  </pic:blipFill>
+                  <pic:spPr bwMode="auto">
+                    <a:xfrm>
+                      <a:off x="0" y="0"/>
+                      <a:ext cx="5619750" cy="3524250"/>
+                    </a:xfrm>
+                    <a:prstGeom prst="rect">
+                      <a:avLst/>
+                    </a:prstGeom>
+                  </pic:spPr>
+                </pic:pic>
+              </a:graphicData>
+            </a:graphic>
+          </wp:inline>
+        </w:drawing>
       </w:r>
     </w:p>
     <w:p>
@@ -20622,7 +19910,7 @@
     </w:p>
     <w:p>
       <w:pPr>
-        <w:spacing w:after="80"/>
+        <w:spacing w:after="100"/>
       </w:pPr>
       <w:r>
         <w:rPr>
@@ -20633,116 +19921,53 @@
           <w:sz w:val="18"/>
           <w:szCs w:val="18"/>
         </w:rPr>
-        <w:t xml:space="preserve">Where to take it:  Postman → import COE558-Cloud-AI-App.postman_collection.json → run requests and show responses</w:t>
-      </w:r>
-    </w:p>
-    <w:tbl>
-      <w:tblPr>
-        <w:tblW w:type="dxa" w:w="9000"/>
-        <w:tblBorders>
-          <w:top w:val="single" w:color="auto" w:sz="4"/>
-          <w:left w:val="single" w:color="auto" w:sz="4"/>
-          <w:bottom w:val="single" w:color="auto" w:sz="4"/>
-          <w:right w:val="single" w:color="auto" w:sz="4"/>
-          <w:insideH w:val="single" w:color="auto" w:sz="4"/>
-          <w:insideV w:val="single" w:color="auto" w:sz="4"/>
-        </w:tblBorders>
-      </w:tblPr>
-      <w:tblGrid>
-        <w:gridCol w:w="9000"/>
-      </w:tblGrid>
-      <w:tr>
-        <w:tc>
-          <w:tcPr>
-            <w:tcW w:type="dxa" w:w="9000"/>
-            <w:tcBorders>
-              <w:top w:color="94A3B8" w:sz="6"/>
-              <w:left w:color="94A3B8" w:sz="6"/>
-              <w:bottom w:color="94A3B8" w:sz="6"/>
-              <w:right w:color="94A3B8" w:sz="6"/>
-            </w:tcBorders>
-            <w:shd w:fill="F7F9FC" w:val="clear"/>
-            <w:tcMar>
-              <w:top w:type="dxa" w:w="200"/>
-              <w:left w:type="dxa" w:w="160"/>
-              <w:bottom w:type="dxa" w:w="200"/>
-              <w:right w:type="dxa" w:w="160"/>
-            </w:tcMar>
-          </w:tcPr>
-          <w:p>
-            <w:pPr>
-              <w:spacing w:after="0"/>
-            </w:pPr>
-            <w:r>
-              <w:t xml:space="preserve"/>
-            </w:r>
-          </w:p>
-          <w:p>
-            <w:pPr>
-              <w:spacing w:after="0"/>
-            </w:pPr>
-            <w:r>
-              <w:t xml:space="preserve"/>
-            </w:r>
-          </w:p>
-          <w:p>
-            <w:pPr>
-              <w:spacing w:after="0"/>
-            </w:pPr>
-            <w:r>
-              <w:t xml:space="preserve"/>
-            </w:r>
-          </w:p>
-          <w:p>
-            <w:pPr>
-              <w:spacing w:after="0"/>
-              <w:jc w:val="center"/>
-            </w:pPr>
-            <w:r>
-              <w:rPr>
-                <w:rFonts w:ascii="Arial" w:cs="Arial" w:eastAsia="Arial" w:hAnsi="Arial"/>
-                <w:i/>
-                <w:iCs/>
-                <w:color w:val="B0B8C8"/>
-                <w:sz w:val="22"/>
-                <w:szCs w:val="22"/>
-              </w:rPr>
-              <w:t xml:space="preserve">[ Insert Screenshot Here ]</w:t>
-            </w:r>
-          </w:p>
-          <w:p>
-            <w:pPr>
-              <w:spacing w:after="0"/>
-            </w:pPr>
-            <w:r>
-              <w:t xml:space="preserve"/>
-            </w:r>
-          </w:p>
-          <w:p>
-            <w:pPr>
-              <w:spacing w:after="0"/>
-            </w:pPr>
-            <w:r>
-              <w:t xml:space="preserve"/>
-            </w:r>
-          </w:p>
-          <w:p>
-            <w:pPr>
-              <w:spacing w:after="0"/>
-            </w:pPr>
-            <w:r>
-              <w:t xml:space="preserve"/>
-            </w:r>
-          </w:p>
-        </w:tc>
-      </w:tr>
-    </w:tbl>
-    <w:p>
-      <w:pPr>
-        <w:spacing w:after="260"/>
-      </w:pPr>
-      <w:r>
-        <w:t xml:space="preserve"/>
+        <w:t xml:space="preserve">Where: Postman Application</w:t>
+      </w:r>
+    </w:p>
+    <w:p>
+      <w:pPr>
+        <w:spacing w:after="300"/>
+        <w:jc w:val="center"/>
+      </w:pPr>
+      <w:r>
+        <w:drawing>
+          <wp:inline distT="0" distB="0" distL="0" distR="0">
+            <wp:extent cx="5619750" cy="3524250"/>
+            <wp:effectExtent t="0" r="0" b="0" l="0"/>
+            <wp:docPr id="1" name="screenshot-12" descr="Postman — Requests to all 3 services with sample responses" title="Postman — Requests to all 3 services with sample responses"/>
+            <wp:cNvGraphicFramePr>
+              <a:graphicFrameLocks xmlns:a="http://schemas.openxmlformats.org/drawingml/2006/main" noChangeAspect="1"/>
+            </wp:cNvGraphicFramePr>
+            <a:graphic xmlns:a="http://schemas.openxmlformats.org/drawingml/2006/main">
+              <a:graphicData uri="http://schemas.openxmlformats.org/drawingml/2006/picture">
+                <pic:pic xmlns:pic="http://schemas.openxmlformats.org/drawingml/2006/picture">
+                  <pic:nvPicPr>
+                    <pic:cNvPr id="0" name="" descr=""/>
+                    <pic:cNvPicPr>
+                      <a:picLocks noChangeAspect="1" noChangeArrowheads="1"/>
+                    </pic:cNvPicPr>
+                  </pic:nvPicPr>
+                  <pic:blipFill>
+                    <a:blip r:embed="rId20" cstate="none"/>
+                    <a:srcRect/>
+                    <a:stretch>
+                      <a:fillRect/>
+                    </a:stretch>
+                  </pic:blipFill>
+                  <pic:spPr bwMode="auto">
+                    <a:xfrm>
+                      <a:off x="0" y="0"/>
+                      <a:ext cx="5619750" cy="3524250"/>
+                    </a:xfrm>
+                    <a:prstGeom prst="rect">
+                      <a:avLst/>
+                    </a:prstGeom>
+                  </pic:spPr>
+                </pic:pic>
+              </a:graphicData>
+            </a:graphic>
+          </wp:inline>
+        </w:drawing>
       </w:r>
     </w:p>
     <w:p>
@@ -20774,7 +19999,7 @@
     </w:p>
     <w:p>
       <w:pPr>
-        <w:spacing w:after="80"/>
+        <w:spacing w:after="100"/>
       </w:pPr>
       <w:r>
         <w:rPr>
@@ -20785,116 +20010,53 @@
           <w:sz w:val="18"/>
           <w:szCs w:val="18"/>
         </w:rPr>
-        <w:t xml:space="preserve">Where to take it:  GCP Console → Cloud Build → Triggers (show 4 triggers: weather, genai, crud, frontend)</w:t>
-      </w:r>
-    </w:p>
-    <w:tbl>
-      <w:tblPr>
-        <w:tblW w:type="dxa" w:w="9000"/>
-        <w:tblBorders>
-          <w:top w:val="single" w:color="auto" w:sz="4"/>
-          <w:left w:val="single" w:color="auto" w:sz="4"/>
-          <w:bottom w:val="single" w:color="auto" w:sz="4"/>
-          <w:right w:val="single" w:color="auto" w:sz="4"/>
-          <w:insideH w:val="single" w:color="auto" w:sz="4"/>
-          <w:insideV w:val="single" w:color="auto" w:sz="4"/>
-        </w:tblBorders>
-      </w:tblPr>
-      <w:tblGrid>
-        <w:gridCol w:w="9000"/>
-      </w:tblGrid>
-      <w:tr>
-        <w:tc>
-          <w:tcPr>
-            <w:tcW w:type="dxa" w:w="9000"/>
-            <w:tcBorders>
-              <w:top w:color="94A3B8" w:sz="6"/>
-              <w:left w:color="94A3B8" w:sz="6"/>
-              <w:bottom w:color="94A3B8" w:sz="6"/>
-              <w:right w:color="94A3B8" w:sz="6"/>
-            </w:tcBorders>
-            <w:shd w:fill="F7F9FC" w:val="clear"/>
-            <w:tcMar>
-              <w:top w:type="dxa" w:w="200"/>
-              <w:left w:type="dxa" w:w="160"/>
-              <w:bottom w:type="dxa" w:w="200"/>
-              <w:right w:type="dxa" w:w="160"/>
-            </w:tcMar>
-          </w:tcPr>
-          <w:p>
-            <w:pPr>
-              <w:spacing w:after="0"/>
-            </w:pPr>
-            <w:r>
-              <w:t xml:space="preserve"/>
-            </w:r>
-          </w:p>
-          <w:p>
-            <w:pPr>
-              <w:spacing w:after="0"/>
-            </w:pPr>
-            <w:r>
-              <w:t xml:space="preserve"/>
-            </w:r>
-          </w:p>
-          <w:p>
-            <w:pPr>
-              <w:spacing w:after="0"/>
-            </w:pPr>
-            <w:r>
-              <w:t xml:space="preserve"/>
-            </w:r>
-          </w:p>
-          <w:p>
-            <w:pPr>
-              <w:spacing w:after="0"/>
-              <w:jc w:val="center"/>
-            </w:pPr>
-            <w:r>
-              <w:rPr>
-                <w:rFonts w:ascii="Arial" w:cs="Arial" w:eastAsia="Arial" w:hAnsi="Arial"/>
-                <w:i/>
-                <w:iCs/>
-                <w:color w:val="B0B8C8"/>
-                <w:sz w:val="22"/>
-                <w:szCs w:val="22"/>
-              </w:rPr>
-              <w:t xml:space="preserve">[ Insert Screenshot Here ]</w:t>
-            </w:r>
-          </w:p>
-          <w:p>
-            <w:pPr>
-              <w:spacing w:after="0"/>
-            </w:pPr>
-            <w:r>
-              <w:t xml:space="preserve"/>
-            </w:r>
-          </w:p>
-          <w:p>
-            <w:pPr>
-              <w:spacing w:after="0"/>
-            </w:pPr>
-            <w:r>
-              <w:t xml:space="preserve"/>
-            </w:r>
-          </w:p>
-          <w:p>
-            <w:pPr>
-              <w:spacing w:after="0"/>
-            </w:pPr>
-            <w:r>
-              <w:t xml:space="preserve"/>
-            </w:r>
-          </w:p>
-        </w:tc>
-      </w:tr>
-    </w:tbl>
-    <w:p>
-      <w:pPr>
-        <w:spacing w:after="260"/>
-      </w:pPr>
-      <w:r>
-        <w:t xml:space="preserve"/>
+        <w:t xml:space="preserve">Where: GCP Console → Cloud Build → Triggers</w:t>
+      </w:r>
+    </w:p>
+    <w:p>
+      <w:pPr>
+        <w:spacing w:after="300"/>
+        <w:jc w:val="center"/>
+      </w:pPr>
+      <w:r>
+        <w:drawing>
+          <wp:inline distT="0" distB="0" distL="0" distR="0">
+            <wp:extent cx="5619750" cy="3524250"/>
+            <wp:effectExtent t="0" r="0" b="0" l="0"/>
+            <wp:docPr id="1" name="screenshot-13" descr="Cloud Build — 4 CI/CD triggers configured for GitHub" title="Cloud Build — 4 CI/CD triggers configured for GitHub"/>
+            <wp:cNvGraphicFramePr>
+              <a:graphicFrameLocks xmlns:a="http://schemas.openxmlformats.org/drawingml/2006/main" noChangeAspect="1"/>
+            </wp:cNvGraphicFramePr>
+            <a:graphic xmlns:a="http://schemas.openxmlformats.org/drawingml/2006/main">
+              <a:graphicData uri="http://schemas.openxmlformats.org/drawingml/2006/picture">
+                <pic:pic xmlns:pic="http://schemas.openxmlformats.org/drawingml/2006/picture">
+                  <pic:nvPicPr>
+                    <pic:cNvPr id="0" name="" descr=""/>
+                    <pic:cNvPicPr>
+                      <a:picLocks noChangeAspect="1" noChangeArrowheads="1"/>
+                    </pic:cNvPicPr>
+                  </pic:nvPicPr>
+                  <pic:blipFill>
+                    <a:blip r:embed="rId21" cstate="none"/>
+                    <a:srcRect/>
+                    <a:stretch>
+                      <a:fillRect/>
+                    </a:stretch>
+                  </pic:blipFill>
+                  <pic:spPr bwMode="auto">
+                    <a:xfrm>
+                      <a:off x="0" y="0"/>
+                      <a:ext cx="5619750" cy="3524250"/>
+                    </a:xfrm>
+                    <a:prstGeom prst="rect">
+                      <a:avLst/>
+                    </a:prstGeom>
+                  </pic:spPr>
+                </pic:pic>
+              </a:graphicData>
+            </a:graphic>
+          </wp:inline>
+        </w:drawing>
       </w:r>
     </w:p>
     <w:p>
@@ -20921,12 +20083,12 @@
           <w:sz w:val="22"/>
           <w:szCs w:val="22"/>
         </w:rPr>
-        <w:t xml:space="preserve">Terraform — terraform/main.tf open in editor or Cloud Shell</w:t>
-      </w:r>
-    </w:p>
-    <w:p>
-      <w:pPr>
-        <w:spacing w:after="80"/>
+        <w:t xml:space="preserve">Terraform — terraform/main.tf showing all GCP resources</w:t>
+      </w:r>
+    </w:p>
+    <w:p>
+      <w:pPr>
+        <w:spacing w:after="100"/>
       </w:pPr>
       <w:r>
         <w:rPr>
@@ -20937,116 +20099,53 @@
           <w:sz w:val="18"/>
           <w:szCs w:val="18"/>
         </w:rPr>
-        <w:t xml:space="preserve">Where to take it:  VS Code or Cloud Shell → open terraform/main.tf (shows all GCP resources defined as code)</w:t>
-      </w:r>
-    </w:p>
-    <w:tbl>
-      <w:tblPr>
-        <w:tblW w:type="dxa" w:w="9000"/>
-        <w:tblBorders>
-          <w:top w:val="single" w:color="auto" w:sz="4"/>
-          <w:left w:val="single" w:color="auto" w:sz="4"/>
-          <w:bottom w:val="single" w:color="auto" w:sz="4"/>
-          <w:right w:val="single" w:color="auto" w:sz="4"/>
-          <w:insideH w:val="single" w:color="auto" w:sz="4"/>
-          <w:insideV w:val="single" w:color="auto" w:sz="4"/>
-        </w:tblBorders>
-      </w:tblPr>
-      <w:tblGrid>
-        <w:gridCol w:w="9000"/>
-      </w:tblGrid>
-      <w:tr>
-        <w:tc>
-          <w:tcPr>
-            <w:tcW w:type="dxa" w:w="9000"/>
-            <w:tcBorders>
-              <w:top w:color="94A3B8" w:sz="6"/>
-              <w:left w:color="94A3B8" w:sz="6"/>
-              <w:bottom w:color="94A3B8" w:sz="6"/>
-              <w:right w:color="94A3B8" w:sz="6"/>
-            </w:tcBorders>
-            <w:shd w:fill="F7F9FC" w:val="clear"/>
-            <w:tcMar>
-              <w:top w:type="dxa" w:w="200"/>
-              <w:left w:type="dxa" w:w="160"/>
-              <w:bottom w:type="dxa" w:w="200"/>
-              <w:right w:type="dxa" w:w="160"/>
-            </w:tcMar>
-          </w:tcPr>
-          <w:p>
-            <w:pPr>
-              <w:spacing w:after="0"/>
-            </w:pPr>
-            <w:r>
-              <w:t xml:space="preserve"/>
-            </w:r>
-          </w:p>
-          <w:p>
-            <w:pPr>
-              <w:spacing w:after="0"/>
-            </w:pPr>
-            <w:r>
-              <w:t xml:space="preserve"/>
-            </w:r>
-          </w:p>
-          <w:p>
-            <w:pPr>
-              <w:spacing w:after="0"/>
-            </w:pPr>
-            <w:r>
-              <w:t xml:space="preserve"/>
-            </w:r>
-          </w:p>
-          <w:p>
-            <w:pPr>
-              <w:spacing w:after="0"/>
-              <w:jc w:val="center"/>
-            </w:pPr>
-            <w:r>
-              <w:rPr>
-                <w:rFonts w:ascii="Arial" w:cs="Arial" w:eastAsia="Arial" w:hAnsi="Arial"/>
-                <w:i/>
-                <w:iCs/>
-                <w:color w:val="B0B8C8"/>
-                <w:sz w:val="22"/>
-                <w:szCs w:val="22"/>
-              </w:rPr>
-              <w:t xml:space="preserve">[ Insert Screenshot Here ]</w:t>
-            </w:r>
-          </w:p>
-          <w:p>
-            <w:pPr>
-              <w:spacing w:after="0"/>
-            </w:pPr>
-            <w:r>
-              <w:t xml:space="preserve"/>
-            </w:r>
-          </w:p>
-          <w:p>
-            <w:pPr>
-              <w:spacing w:after="0"/>
-            </w:pPr>
-            <w:r>
-              <w:t xml:space="preserve"/>
-            </w:r>
-          </w:p>
-          <w:p>
-            <w:pPr>
-              <w:spacing w:after="0"/>
-            </w:pPr>
-            <w:r>
-              <w:t xml:space="preserve"/>
-            </w:r>
-          </w:p>
-        </w:tc>
-      </w:tr>
-    </w:tbl>
-    <w:p>
-      <w:pPr>
-        <w:spacing w:after="260"/>
-      </w:pPr>
-      <w:r>
-        <w:t xml:space="preserve"/>
+        <w:t xml:space="preserve">Where: VS Code → terraform/main.tf</w:t>
+      </w:r>
+    </w:p>
+    <w:p>
+      <w:pPr>
+        <w:spacing w:after="300"/>
+        <w:jc w:val="center"/>
+      </w:pPr>
+      <w:r>
+        <w:drawing>
+          <wp:inline distT="0" distB="0" distL="0" distR="0">
+            <wp:extent cx="5619750" cy="3524250"/>
+            <wp:effectExtent t="0" r="0" b="0" l="0"/>
+            <wp:docPr id="1" name="screenshot-14" descr="Terraform — terraform/main.tf showing all GCP resources" title="Terraform — terraform/main.tf showing all GCP resources"/>
+            <wp:cNvGraphicFramePr>
+              <a:graphicFrameLocks xmlns:a="http://schemas.openxmlformats.org/drawingml/2006/main" noChangeAspect="1"/>
+            </wp:cNvGraphicFramePr>
+            <a:graphic xmlns:a="http://schemas.openxmlformats.org/drawingml/2006/main">
+              <a:graphicData uri="http://schemas.openxmlformats.org/drawingml/2006/picture">
+                <pic:pic xmlns:pic="http://schemas.openxmlformats.org/drawingml/2006/picture">
+                  <pic:nvPicPr>
+                    <pic:cNvPr id="0" name="" descr=""/>
+                    <pic:cNvPicPr>
+                      <a:picLocks noChangeAspect="1" noChangeArrowheads="1"/>
+                    </pic:cNvPicPr>
+                  </pic:nvPicPr>
+                  <pic:blipFill>
+                    <a:blip r:embed="rId22" cstate="none"/>
+                    <a:srcRect/>
+                    <a:stretch>
+                      <a:fillRect/>
+                    </a:stretch>
+                  </pic:blipFill>
+                  <pic:spPr bwMode="auto">
+                    <a:xfrm>
+                      <a:off x="0" y="0"/>
+                      <a:ext cx="5619750" cy="3524250"/>
+                    </a:xfrm>
+                    <a:prstGeom prst="rect">
+                      <a:avLst/>
+                    </a:prstGeom>
+                  </pic:spPr>
+                </pic:pic>
+              </a:graphicData>
+            </a:graphic>
+          </wp:inline>
+        </w:drawing>
       </w:r>
     </w:p>
     <w:p>
@@ -21087,7 +20186,7 @@
           <w:sz w:val="26"/>
           <w:szCs w:val="26"/>
         </w:rPr>
-        <w:t xml:space="preserve">[Insert demo recording link here — Google Drive or YouTube]</w:t>
+        <w:t xml:space="preserve">https://drive.google.com/file/d/1wY5cBikgvICOAo52dJQFpbQYekBTbvYL/view?usp=sharing</w:t>
       </w:r>
     </w:p>
     <w:p>
@@ -22343,7 +21442,7 @@
         <w:sz w:val="18"/>
         <w:szCs w:val="18"/>
       </w:rPr>
-      <w:t xml:space="preserve">COE 558 — Cloud and Edge Computing — Shouq Almutairi — Term 252</w:t>
+      <w:t xml:space="preserve">COE 558 — Cloud and Edge Computing — Abdullah Saeed Almalki — Term 252</w:t>
     </w:r>
   </w:p>
 </w:hdr>

</xml_diff>